<commit_message>
Complete Module 01 documentation
</commit_message>
<xml_diff>
--- a/00_Proje_Yönetimi/Sprint Planı.docx
+++ b/00_Proje_Yönetimi/Sprint Planı.docx
@@ -521,7 +521,21 @@
           <w:rFonts w:ascii="Times New Roman" w:hAnsi="Times New Roman" w:cs="Times New Roman"/>
           <w:lang w:eastAsia="tr-TR"/>
         </w:rPr>
-        <w:t xml:space="preserve"> güncelle </w:t>
+        <w:t xml:space="preserve"> </w:t>
+      </w:r>
+      <w:r>
+        <w:rPr>
+          <w:rFonts w:ascii="Times New Roman" w:hAnsi="Times New Roman" w:cs="Times New Roman"/>
+          <w:lang w:eastAsia="tr-TR"/>
+        </w:rPr>
+        <w:t>oluştur</w:t>
+      </w:r>
+      <w:r>
+        <w:rPr>
+          <w:rFonts w:ascii="Times New Roman" w:hAnsi="Times New Roman" w:cs="Times New Roman"/>
+          <w:lang w:eastAsia="tr-TR"/>
+        </w:rPr>
+        <w:t xml:space="preserve"> </w:t>
       </w:r>
     </w:p>
     <w:p>
@@ -558,7 +572,14 @@
           <w:rFonts w:ascii="Times New Roman" w:hAnsi="Times New Roman" w:cs="Times New Roman"/>
           <w:lang w:eastAsia="tr-TR"/>
         </w:rPr>
-        <w:t xml:space="preserve"> güncelle </w:t>
+        <w:t xml:space="preserve"> </w:t>
+      </w:r>
+      <w:r>
+        <w:rPr>
+          <w:rFonts w:ascii="Times New Roman" w:hAnsi="Times New Roman" w:cs="Times New Roman"/>
+          <w:lang w:eastAsia="tr-TR"/>
+        </w:rPr>
+        <w:t>oluştur</w:t>
       </w:r>
     </w:p>
     <w:p>
@@ -646,6 +667,29 @@
           <w:lang w:eastAsia="tr-TR"/>
         </w:rPr>
       </w:pPr>
+      <w:bookmarkStart w:id="0" w:name="_Hlk235218986"/>
+      <w:r>
+        <w:rPr>
+          <w:rFonts w:ascii="Times New Roman" w:hAnsi="Times New Roman" w:cs="Times New Roman"/>
+          <w:lang w:eastAsia="tr-TR"/>
+        </w:rPr>
+        <w:t>İçindekiler sayfasını oluştur</w:t>
+      </w:r>
+    </w:p>
+    <w:bookmarkEnd w:id="0"/>
+    <w:p>
+      <w:pPr>
+        <w:pStyle w:val="ListeParagraf"/>
+        <w:numPr>
+          <w:ilvl w:val="0"/>
+          <w:numId w:val="19"/>
+        </w:numPr>
+        <w:spacing w:after="0" w:line="360" w:lineRule="auto"/>
+        <w:rPr>
+          <w:rFonts w:ascii="Times New Roman" w:hAnsi="Times New Roman" w:cs="Times New Roman"/>
+          <w:lang w:eastAsia="tr-TR"/>
+        </w:rPr>
+      </w:pPr>
       <w:proofErr w:type="spellStart"/>
       <w:r>
         <w:rPr>
@@ -668,28 +712,6 @@
         <w:spacing w:after="0" w:line="360" w:lineRule="auto"/>
         <w:rPr>
           <w:rFonts w:ascii="Times New Roman" w:hAnsi="Times New Roman" w:cs="Times New Roman"/>
-          <w:lang w:eastAsia="tr-TR"/>
-        </w:rPr>
-      </w:pPr>
-    </w:p>
-    <w:p>
-      <w:pPr>
-        <w:spacing w:after="0" w:line="360" w:lineRule="auto"/>
-        <w:rPr>
-          <w:rFonts w:ascii="Times New Roman" w:hAnsi="Times New Roman" w:cs="Times New Roman"/>
-          <w:b/>
-          <w:bCs/>
-          <w:lang w:eastAsia="tr-TR"/>
-        </w:rPr>
-      </w:pPr>
-    </w:p>
-    <w:p>
-      <w:pPr>
-        <w:spacing w:after="0" w:line="360" w:lineRule="auto"/>
-        <w:rPr>
-          <w:rFonts w:ascii="Times New Roman" w:hAnsi="Times New Roman" w:cs="Times New Roman"/>
-          <w:b/>
-          <w:bCs/>
           <w:lang w:eastAsia="tr-TR"/>
         </w:rPr>
       </w:pPr>
@@ -748,6 +770,7 @@
           <w:szCs w:val="28"/>
           <w:lang w:eastAsia="tr-TR"/>
         </w:rPr>
+        <w:lastRenderedPageBreak/>
         <w:t>Sprint 2 — Yetkisiz Kullanıcı: Kayıt ve Giriş</w:t>
       </w:r>
     </w:p>
@@ -840,7 +863,14 @@
           <w:rFonts w:ascii="Times New Roman" w:hAnsi="Times New Roman" w:cs="Times New Roman"/>
           <w:lang w:eastAsia="tr-TR"/>
         </w:rPr>
-        <w:t>Checklist'i</w:t>
+        <w:t>Checklist</w:t>
+      </w:r>
+      <w:r>
+        <w:rPr>
+          <w:rFonts w:ascii="Times New Roman" w:hAnsi="Times New Roman" w:cs="Times New Roman"/>
+          <w:lang w:eastAsia="tr-TR"/>
+        </w:rPr>
+        <w:t>’leri</w:t>
       </w:r>
       <w:proofErr w:type="spellEnd"/>
       <w:r>
@@ -848,7 +878,21 @@
           <w:rFonts w:ascii="Times New Roman" w:hAnsi="Times New Roman" w:cs="Times New Roman"/>
           <w:lang w:eastAsia="tr-TR"/>
         </w:rPr>
-        <w:t xml:space="preserve"> güncelle </w:t>
+        <w:t xml:space="preserve"> </w:t>
+      </w:r>
+      <w:r>
+        <w:rPr>
+          <w:rFonts w:ascii="Times New Roman" w:hAnsi="Times New Roman" w:cs="Times New Roman"/>
+          <w:lang w:eastAsia="tr-TR"/>
+        </w:rPr>
+        <w:t>oluştur</w:t>
+      </w:r>
+      <w:r>
+        <w:rPr>
+          <w:rFonts w:ascii="Times New Roman" w:hAnsi="Times New Roman" w:cs="Times New Roman"/>
+          <w:lang w:eastAsia="tr-TR"/>
+        </w:rPr>
+        <w:t xml:space="preserve"> </w:t>
       </w:r>
     </w:p>
     <w:p>
@@ -885,7 +929,21 @@
           <w:rFonts w:ascii="Times New Roman" w:hAnsi="Times New Roman" w:cs="Times New Roman"/>
           <w:lang w:eastAsia="tr-TR"/>
         </w:rPr>
-        <w:t xml:space="preserve"> güncelle </w:t>
+        <w:t xml:space="preserve"> </w:t>
+      </w:r>
+      <w:r>
+        <w:rPr>
+          <w:rFonts w:ascii="Times New Roman" w:hAnsi="Times New Roman" w:cs="Times New Roman"/>
+          <w:lang w:eastAsia="tr-TR"/>
+        </w:rPr>
+        <w:t>oluştur</w:t>
+      </w:r>
+      <w:r>
+        <w:rPr>
+          <w:rFonts w:ascii="Times New Roman" w:hAnsi="Times New Roman" w:cs="Times New Roman"/>
+          <w:lang w:eastAsia="tr-TR"/>
+        </w:rPr>
+        <w:t xml:space="preserve"> </w:t>
       </w:r>
     </w:p>
     <w:p>
@@ -1105,6 +1163,27 @@
           <w:lang w:eastAsia="tr-TR"/>
         </w:rPr>
         <w:t xml:space="preserve"> Report oluştur </w:t>
+      </w:r>
+    </w:p>
+    <w:p>
+      <w:pPr>
+        <w:pStyle w:val="ListeParagraf"/>
+        <w:numPr>
+          <w:ilvl w:val="0"/>
+          <w:numId w:val="20"/>
+        </w:numPr>
+        <w:spacing w:after="0" w:line="360" w:lineRule="auto"/>
+        <w:rPr>
+          <w:rFonts w:ascii="Times New Roman" w:hAnsi="Times New Roman" w:cs="Times New Roman"/>
+          <w:lang w:eastAsia="tr-TR"/>
+        </w:rPr>
+      </w:pPr>
+      <w:r>
+        <w:rPr>
+          <w:rFonts w:ascii="Times New Roman" w:hAnsi="Times New Roman" w:cs="Times New Roman"/>
+          <w:lang w:eastAsia="tr-TR"/>
+        </w:rPr>
+        <w:t>İçindekiler sayfasını oluştur</w:t>
       </w:r>
     </w:p>
     <w:p>
@@ -1280,7 +1359,14 @@
           <w:rFonts w:ascii="Times New Roman" w:hAnsi="Times New Roman" w:cs="Times New Roman"/>
           <w:lang w:eastAsia="tr-TR"/>
         </w:rPr>
-        <w:t xml:space="preserve"> güncelle </w:t>
+        <w:t xml:space="preserve"> </w:t>
+      </w:r>
+      <w:r>
+        <w:rPr>
+          <w:rFonts w:ascii="Times New Roman" w:hAnsi="Times New Roman" w:cs="Times New Roman"/>
+          <w:lang w:eastAsia="tr-TR"/>
+        </w:rPr>
+        <w:t>oluştur</w:t>
       </w:r>
     </w:p>
     <w:p>
@@ -1317,7 +1403,21 @@
           <w:rFonts w:ascii="Times New Roman" w:hAnsi="Times New Roman" w:cs="Times New Roman"/>
           <w:lang w:eastAsia="tr-TR"/>
         </w:rPr>
-        <w:t xml:space="preserve"> güncelle </w:t>
+        <w:t xml:space="preserve"> </w:t>
+      </w:r>
+      <w:r>
+        <w:rPr>
+          <w:rFonts w:ascii="Times New Roman" w:hAnsi="Times New Roman" w:cs="Times New Roman"/>
+          <w:lang w:eastAsia="tr-TR"/>
+        </w:rPr>
+        <w:t>oluştur</w:t>
+      </w:r>
+      <w:r>
+        <w:rPr>
+          <w:rFonts w:ascii="Times New Roman" w:hAnsi="Times New Roman" w:cs="Times New Roman"/>
+          <w:lang w:eastAsia="tr-TR"/>
+        </w:rPr>
+        <w:t xml:space="preserve"> </w:t>
       </w:r>
     </w:p>
     <w:p>
@@ -1486,6 +1586,27 @@
           <w:lang w:eastAsia="tr-TR"/>
         </w:rPr>
       </w:pPr>
+      <w:r>
+        <w:rPr>
+          <w:rFonts w:ascii="Times New Roman" w:hAnsi="Times New Roman" w:cs="Times New Roman"/>
+          <w:lang w:eastAsia="tr-TR"/>
+        </w:rPr>
+        <w:t>İçindekiler sayfasını oluştur</w:t>
+      </w:r>
+    </w:p>
+    <w:p>
+      <w:pPr>
+        <w:pStyle w:val="ListeParagraf"/>
+        <w:numPr>
+          <w:ilvl w:val="0"/>
+          <w:numId w:val="21"/>
+        </w:numPr>
+        <w:spacing w:after="0" w:line="360" w:lineRule="auto"/>
+        <w:rPr>
+          <w:rFonts w:ascii="Times New Roman" w:hAnsi="Times New Roman" w:cs="Times New Roman"/>
+          <w:lang w:eastAsia="tr-TR"/>
+        </w:rPr>
+      </w:pPr>
       <w:proofErr w:type="spellStart"/>
       <w:r>
         <w:rPr>
@@ -1502,15 +1623,6 @@
         </w:rPr>
         <w:t xml:space="preserve"> güncellemesi </w:t>
       </w:r>
-    </w:p>
-    <w:p>
-      <w:pPr>
-        <w:spacing w:after="0" w:line="360" w:lineRule="auto"/>
-        <w:rPr>
-          <w:rFonts w:ascii="Times New Roman" w:hAnsi="Times New Roman" w:cs="Times New Roman"/>
-          <w:lang w:eastAsia="tr-TR"/>
-        </w:rPr>
-      </w:pPr>
     </w:p>
     <w:p>
       <w:pPr>
@@ -1674,7 +1786,21 @@
           <w:rFonts w:ascii="Times New Roman" w:hAnsi="Times New Roman" w:cs="Times New Roman"/>
           <w:lang w:eastAsia="tr-TR"/>
         </w:rPr>
-        <w:t xml:space="preserve"> güncelle </w:t>
+        <w:t xml:space="preserve"> </w:t>
+      </w:r>
+      <w:r>
+        <w:rPr>
+          <w:rFonts w:ascii="Times New Roman" w:hAnsi="Times New Roman" w:cs="Times New Roman"/>
+          <w:lang w:eastAsia="tr-TR"/>
+        </w:rPr>
+        <w:t>oluştur</w:t>
+      </w:r>
+      <w:r>
+        <w:rPr>
+          <w:rFonts w:ascii="Times New Roman" w:hAnsi="Times New Roman" w:cs="Times New Roman"/>
+          <w:lang w:eastAsia="tr-TR"/>
+        </w:rPr>
+        <w:t xml:space="preserve"> </w:t>
       </w:r>
     </w:p>
     <w:p>
@@ -1711,7 +1837,21 @@
           <w:rFonts w:ascii="Times New Roman" w:hAnsi="Times New Roman" w:cs="Times New Roman"/>
           <w:lang w:eastAsia="tr-TR"/>
         </w:rPr>
-        <w:t xml:space="preserve"> güncelle </w:t>
+        <w:t xml:space="preserve"> </w:t>
+      </w:r>
+      <w:r>
+        <w:rPr>
+          <w:rFonts w:ascii="Times New Roman" w:hAnsi="Times New Roman" w:cs="Times New Roman"/>
+          <w:lang w:eastAsia="tr-TR"/>
+        </w:rPr>
+        <w:t>oluştur</w:t>
+      </w:r>
+      <w:r>
+        <w:rPr>
+          <w:rFonts w:ascii="Times New Roman" w:hAnsi="Times New Roman" w:cs="Times New Roman"/>
+          <w:lang w:eastAsia="tr-TR"/>
+        </w:rPr>
+        <w:t xml:space="preserve"> </w:t>
       </w:r>
     </w:p>
     <w:p>
@@ -1862,6 +2002,27 @@
           <w:lang w:eastAsia="tr-TR"/>
         </w:rPr>
         <w:t xml:space="preserve"> Report oluştur </w:t>
+      </w:r>
+    </w:p>
+    <w:p>
+      <w:pPr>
+        <w:pStyle w:val="ListeParagraf"/>
+        <w:numPr>
+          <w:ilvl w:val="0"/>
+          <w:numId w:val="22"/>
+        </w:numPr>
+        <w:spacing w:after="0" w:line="360" w:lineRule="auto"/>
+        <w:rPr>
+          <w:rFonts w:ascii="Times New Roman" w:hAnsi="Times New Roman" w:cs="Times New Roman"/>
+          <w:lang w:eastAsia="tr-TR"/>
+        </w:rPr>
+      </w:pPr>
+      <w:r>
+        <w:rPr>
+          <w:rFonts w:ascii="Times New Roman" w:hAnsi="Times New Roman" w:cs="Times New Roman"/>
+          <w:lang w:eastAsia="tr-TR"/>
+        </w:rPr>
+        <w:t>İçindekiler sayfasını oluştur</w:t>
       </w:r>
     </w:p>
     <w:p>
@@ -2037,7 +2198,14 @@
           <w:rFonts w:ascii="Times New Roman" w:hAnsi="Times New Roman" w:cs="Times New Roman"/>
           <w:lang w:eastAsia="tr-TR"/>
         </w:rPr>
-        <w:t xml:space="preserve"> güncelle </w:t>
+        <w:t xml:space="preserve"> </w:t>
+      </w:r>
+      <w:r>
+        <w:rPr>
+          <w:rFonts w:ascii="Times New Roman" w:hAnsi="Times New Roman" w:cs="Times New Roman"/>
+          <w:lang w:eastAsia="tr-TR"/>
+        </w:rPr>
+        <w:t>oluştur</w:t>
       </w:r>
     </w:p>
     <w:p>
@@ -2074,7 +2242,14 @@
           <w:rFonts w:ascii="Times New Roman" w:hAnsi="Times New Roman" w:cs="Times New Roman"/>
           <w:lang w:eastAsia="tr-TR"/>
         </w:rPr>
-        <w:t xml:space="preserve"> güncelle </w:t>
+        <w:t xml:space="preserve"> </w:t>
+      </w:r>
+      <w:r>
+        <w:rPr>
+          <w:rFonts w:ascii="Times New Roman" w:hAnsi="Times New Roman" w:cs="Times New Roman"/>
+          <w:lang w:eastAsia="tr-TR"/>
+        </w:rPr>
+        <w:t>oluştur</w:t>
       </w:r>
     </w:p>
     <w:p>
@@ -2354,6 +2529,27 @@
           <w:lang w:eastAsia="tr-TR"/>
         </w:rPr>
       </w:pPr>
+      <w:r>
+        <w:rPr>
+          <w:rFonts w:ascii="Times New Roman" w:hAnsi="Times New Roman" w:cs="Times New Roman"/>
+          <w:lang w:eastAsia="tr-TR"/>
+        </w:rPr>
+        <w:t>İçindekiler sayfasını oluştur</w:t>
+      </w:r>
+    </w:p>
+    <w:p>
+      <w:pPr>
+        <w:pStyle w:val="ListeParagraf"/>
+        <w:numPr>
+          <w:ilvl w:val="0"/>
+          <w:numId w:val="23"/>
+        </w:numPr>
+        <w:spacing w:after="0" w:line="360" w:lineRule="auto"/>
+        <w:rPr>
+          <w:rFonts w:ascii="Times New Roman" w:hAnsi="Times New Roman" w:cs="Times New Roman"/>
+          <w:lang w:eastAsia="tr-TR"/>
+        </w:rPr>
+      </w:pPr>
       <w:proofErr w:type="spellStart"/>
       <w:r>
         <w:rPr>
@@ -2370,24 +2566,6 @@
         </w:rPr>
         <w:t xml:space="preserve"> güncellemesi </w:t>
       </w:r>
-    </w:p>
-    <w:p>
-      <w:pPr>
-        <w:spacing w:after="0" w:line="360" w:lineRule="auto"/>
-        <w:rPr>
-          <w:rFonts w:ascii="Times New Roman" w:hAnsi="Times New Roman" w:cs="Times New Roman"/>
-          <w:lang w:eastAsia="tr-TR"/>
-        </w:rPr>
-      </w:pPr>
-    </w:p>
-    <w:p>
-      <w:pPr>
-        <w:spacing w:after="0" w:line="360" w:lineRule="auto"/>
-        <w:rPr>
-          <w:rFonts w:ascii="Times New Roman" w:hAnsi="Times New Roman" w:cs="Times New Roman"/>
-          <w:lang w:eastAsia="tr-TR"/>
-        </w:rPr>
-      </w:pPr>
     </w:p>
     <w:p>
       <w:pPr>
@@ -2535,7 +2713,21 @@
           <w:rFonts w:ascii="Times New Roman" w:hAnsi="Times New Roman" w:cs="Times New Roman"/>
           <w:lang w:eastAsia="tr-TR"/>
         </w:rPr>
-        <w:t xml:space="preserve"> güncelle </w:t>
+        <w:t xml:space="preserve"> </w:t>
+      </w:r>
+      <w:r>
+        <w:rPr>
+          <w:rFonts w:ascii="Times New Roman" w:hAnsi="Times New Roman" w:cs="Times New Roman"/>
+          <w:lang w:eastAsia="tr-TR"/>
+        </w:rPr>
+        <w:t>Oluştur</w:t>
+      </w:r>
+      <w:r>
+        <w:rPr>
+          <w:rFonts w:ascii="Times New Roman" w:hAnsi="Times New Roman" w:cs="Times New Roman"/>
+          <w:lang w:eastAsia="tr-TR"/>
+        </w:rPr>
+        <w:t xml:space="preserve"> </w:t>
       </w:r>
     </w:p>
     <w:p>
@@ -2572,7 +2764,21 @@
           <w:rFonts w:ascii="Times New Roman" w:hAnsi="Times New Roman" w:cs="Times New Roman"/>
           <w:lang w:eastAsia="tr-TR"/>
         </w:rPr>
-        <w:t xml:space="preserve"> güncelle </w:t>
+        <w:t xml:space="preserve"> </w:t>
+      </w:r>
+      <w:r>
+        <w:rPr>
+          <w:rFonts w:ascii="Times New Roman" w:hAnsi="Times New Roman" w:cs="Times New Roman"/>
+          <w:lang w:eastAsia="tr-TR"/>
+        </w:rPr>
+        <w:t>Oluştur</w:t>
+      </w:r>
+      <w:r>
+        <w:rPr>
+          <w:rFonts w:ascii="Times New Roman" w:hAnsi="Times New Roman" w:cs="Times New Roman"/>
+          <w:lang w:eastAsia="tr-TR"/>
+        </w:rPr>
+        <w:t xml:space="preserve"> </w:t>
       </w:r>
     </w:p>
     <w:p>
@@ -2788,6 +2994,27 @@
           <w:lang w:eastAsia="tr-TR"/>
         </w:rPr>
         <w:t xml:space="preserve"> Report oluştur </w:t>
+      </w:r>
+    </w:p>
+    <w:p>
+      <w:pPr>
+        <w:pStyle w:val="ListeParagraf"/>
+        <w:numPr>
+          <w:ilvl w:val="0"/>
+          <w:numId w:val="24"/>
+        </w:numPr>
+        <w:spacing w:after="0" w:line="360" w:lineRule="auto"/>
+        <w:rPr>
+          <w:rFonts w:ascii="Times New Roman" w:hAnsi="Times New Roman" w:cs="Times New Roman"/>
+          <w:lang w:eastAsia="tr-TR"/>
+        </w:rPr>
+      </w:pPr>
+      <w:r>
+        <w:rPr>
+          <w:rFonts w:ascii="Times New Roman" w:hAnsi="Times New Roman" w:cs="Times New Roman"/>
+          <w:lang w:eastAsia="tr-TR"/>
+        </w:rPr>
+        <w:t>İçindekiler sayfasını oluştur</w:t>
       </w:r>
     </w:p>
     <w:p>
@@ -3129,15 +3356,6 @@
         </w:rPr>
         <w:t xml:space="preserve"> güncellemesi </w:t>
       </w:r>
-    </w:p>
-    <w:p>
-      <w:pPr>
-        <w:spacing w:after="0" w:line="360" w:lineRule="auto"/>
-        <w:rPr>
-          <w:rFonts w:ascii="Times New Roman" w:hAnsi="Times New Roman" w:cs="Times New Roman"/>
-          <w:lang w:eastAsia="tr-TR"/>
-        </w:rPr>
-      </w:pPr>
     </w:p>
     <w:p>
       <w:pPr>
@@ -3334,7 +3552,21 @@
           <w:rFonts w:ascii="Times New Roman" w:hAnsi="Times New Roman" w:cs="Times New Roman"/>
           <w:lang w:eastAsia="tr-TR"/>
         </w:rPr>
-        <w:t xml:space="preserve"> güncelle </w:t>
+        <w:t xml:space="preserve"> </w:t>
+      </w:r>
+      <w:r>
+        <w:rPr>
+          <w:rFonts w:ascii="Times New Roman" w:hAnsi="Times New Roman" w:cs="Times New Roman"/>
+          <w:lang w:eastAsia="tr-TR"/>
+        </w:rPr>
+        <w:t>Oluştur</w:t>
+      </w:r>
+      <w:r>
+        <w:rPr>
+          <w:rFonts w:ascii="Times New Roman" w:hAnsi="Times New Roman" w:cs="Times New Roman"/>
+          <w:lang w:eastAsia="tr-TR"/>
+        </w:rPr>
+        <w:t xml:space="preserve"> </w:t>
       </w:r>
     </w:p>
     <w:p>
@@ -3371,7 +3603,21 @@
           <w:rFonts w:ascii="Times New Roman" w:hAnsi="Times New Roman" w:cs="Times New Roman"/>
           <w:lang w:eastAsia="tr-TR"/>
         </w:rPr>
-        <w:t xml:space="preserve"> güncelle </w:t>
+        <w:t xml:space="preserve"> </w:t>
+      </w:r>
+      <w:r>
+        <w:rPr>
+          <w:rFonts w:ascii="Times New Roman" w:hAnsi="Times New Roman" w:cs="Times New Roman"/>
+          <w:lang w:eastAsia="tr-TR"/>
+        </w:rPr>
+        <w:t>Oluştur</w:t>
+      </w:r>
+      <w:r>
+        <w:rPr>
+          <w:rFonts w:ascii="Times New Roman" w:hAnsi="Times New Roman" w:cs="Times New Roman"/>
+          <w:lang w:eastAsia="tr-TR"/>
+        </w:rPr>
+        <w:t xml:space="preserve"> </w:t>
       </w:r>
     </w:p>
     <w:p>
@@ -3619,6 +3865,27 @@
           <w:lang w:eastAsia="tr-TR"/>
         </w:rPr>
         <w:t xml:space="preserve"> Report oluştur </w:t>
+      </w:r>
+    </w:p>
+    <w:p>
+      <w:pPr>
+        <w:pStyle w:val="ListeParagraf"/>
+        <w:numPr>
+          <w:ilvl w:val="0"/>
+          <w:numId w:val="26"/>
+        </w:numPr>
+        <w:spacing w:after="0" w:line="360" w:lineRule="auto"/>
+        <w:rPr>
+          <w:rFonts w:ascii="Times New Roman" w:hAnsi="Times New Roman" w:cs="Times New Roman"/>
+          <w:lang w:eastAsia="tr-TR"/>
+        </w:rPr>
+      </w:pPr>
+      <w:r>
+        <w:rPr>
+          <w:rFonts w:ascii="Times New Roman" w:hAnsi="Times New Roman" w:cs="Times New Roman"/>
+          <w:lang w:eastAsia="tr-TR"/>
+        </w:rPr>
+        <w:t>İçindekiler sayfasını oluştur</w:t>
       </w:r>
     </w:p>
     <w:p>
@@ -3964,6 +4231,27 @@
           <w:lang w:eastAsia="tr-TR"/>
         </w:rPr>
       </w:pPr>
+      <w:r>
+        <w:rPr>
+          <w:rFonts w:ascii="Times New Roman" w:hAnsi="Times New Roman" w:cs="Times New Roman"/>
+          <w:lang w:eastAsia="tr-TR"/>
+        </w:rPr>
+        <w:t>İçindekiler sayfasını oluştur</w:t>
+      </w:r>
+    </w:p>
+    <w:p>
+      <w:pPr>
+        <w:pStyle w:val="ListeParagraf"/>
+        <w:numPr>
+          <w:ilvl w:val="0"/>
+          <w:numId w:val="27"/>
+        </w:numPr>
+        <w:spacing w:after="0" w:line="360" w:lineRule="auto"/>
+        <w:rPr>
+          <w:rFonts w:ascii="Times New Roman" w:hAnsi="Times New Roman" w:cs="Times New Roman"/>
+          <w:lang w:eastAsia="tr-TR"/>
+        </w:rPr>
+      </w:pPr>
       <w:proofErr w:type="spellStart"/>
       <w:r>
         <w:rPr>
@@ -3980,24 +4268,6 @@
         </w:rPr>
         <w:t xml:space="preserve"> güncellemesi</w:t>
       </w:r>
-    </w:p>
-    <w:p>
-      <w:pPr>
-        <w:spacing w:after="0" w:line="360" w:lineRule="auto"/>
-        <w:rPr>
-          <w:rFonts w:ascii="Times New Roman" w:hAnsi="Times New Roman" w:cs="Times New Roman"/>
-          <w:lang w:eastAsia="tr-TR"/>
-        </w:rPr>
-      </w:pPr>
-    </w:p>
-    <w:p>
-      <w:pPr>
-        <w:spacing w:after="0" w:line="360" w:lineRule="auto"/>
-        <w:rPr>
-          <w:rFonts w:ascii="Times New Roman" w:hAnsi="Times New Roman" w:cs="Times New Roman"/>
-          <w:lang w:eastAsia="tr-TR"/>
-        </w:rPr>
-      </w:pPr>
     </w:p>
     <w:p>
       <w:pPr>

</xml_diff>